<commit_message>
docs: ayunan WS-4/WS-5 = artefak acuan; WS-3 naik ~6 % sekitar 10 Agu 2026
Dengan pembanding tetap WS-3/4/5, ayunan WS-4 0,023 dan WS-5 0,040 (< 5 %).
WS-3 melompat +5,7 % terhadap WS-4/5 sekitar 10 Agu (kubah dibersihkan?);
WS-2 turun ~3 % bersamaan. Daftar periksa lapangan (md + docx) ditambah
bagian log pembersihan pyranometer.

Co-Authored-By: Claude Opus 5.5 <noreply@anthropic.com>
</commit_message>
<xml_diff>
--- a/docs/Pemeriksaan_Lapangan_WS1_WS2.docx
+++ b/docs/Pemeriksaan_Lapangan_WS1_WS2.docx
@@ -2426,7 +2426,442 @@
         <w:rPr>
           <w:color w:val="1F3A5F"/>
         </w:rPr>
-        <w:t>3. Sesudah kunjungan</w:t>
+        <w:t>3. Semua stasiun: log pembersihan dan pemeliharaan pyranometer</w:t>
+      </w:r>
+    </w:p>
+    <w:p>
+      <w:pPr>
+        <w:pStyle w:val="Heading2"/>
+      </w:pPr>
+      <w:r>
+        <w:rPr>
+          <w:color w:val="1F3A5F"/>
+        </w:rPr>
+        <w:t>Yang terlihat di data</w:t>
+      </w:r>
+    </w:p>
+    <w:p>
+      <w:pPr>
+        <w:pStyle w:val="ListBullet"/>
+      </w:pPr>
+      <w:r>
+        <w:rPr>
+          <w:b/>
+        </w:rPr>
+        <w:t>WS-3 naik ~6 % sekitar 10 Agu 2026</w:t>
+      </w:r>
+      <w:r>
+        <w:rPr>
+          <w:b w:val="0"/>
+        </w:rPr>
+        <w:t xml:space="preserve"> terhadap WS-4/WS-5 (yang stabil satu sama lain, +0,6 %). Sejak Jan 2026 WS-3 membaca ~5–7 % di bawah WS-4/5, lalu kembali ke ~1,0. Pola ini cocok dengan kubah kotor yang dibersihkan, atau sensor yang dikalibrasi ulang/diganti.</w:t>
+      </w:r>
+    </w:p>
+    <w:p>
+      <w:pPr>
+        <w:pStyle w:val="ListBullet"/>
+      </w:pPr>
+      <w:r>
+        <w:rPr>
+          <w:b w:val="0"/>
+        </w:rPr>
+        <w:t xml:space="preserve">Pada saat yang sama </w:t>
+      </w:r>
+      <w:r>
+        <w:rPr>
+          <w:b/>
+        </w:rPr>
+        <w:t>WS-2 tampak turun ~3 %</w:t>
+      </w:r>
+      <w:r>
+        <w:rPr>
+          <w:b w:val="0"/>
+        </w:rPr>
+        <w:t>.</w:t>
+      </w:r>
+    </w:p>
+    <w:p>
+      <w:pPr>
+        <w:pStyle w:val="Heading2"/>
+      </w:pPr>
+      <w:r>
+        <w:rPr>
+          <w:color w:val="1F3A5F"/>
+        </w:rPr>
+        <w:t>Yang ditanyakan</w:t>
+      </w:r>
+    </w:p>
+    <w:tbl>
+      <w:tblPr>
+        <w:tblStyle w:val="TableGrid"/>
+        <w:tblW w:type="auto" w:w="0"/>
+        <w:jc w:val="center"/>
+        <w:tblLayout w:type="fixed"/>
+        <w:tblLook w:firstColumn="1" w:firstRow="1" w:lastColumn="0" w:lastRow="0" w:noHBand="0" w:noVBand="1" w:val="04A0"/>
+      </w:tblPr>
+      <w:tblGrid>
+        <w:gridCol w:w="1928"/>
+        <w:gridCol w:w="1928"/>
+        <w:gridCol w:w="1928"/>
+        <w:gridCol w:w="1928"/>
+        <w:gridCol w:w="1928"/>
+      </w:tblGrid>
+      <w:tr>
+        <w:tc>
+          <w:tcPr>
+            <w:tcW w:type="dxa" w:w="397"/>
+            <w:shd w:val="clear" w:color="auto" w:fill="D9E2F3"/>
+          </w:tcPr>
+          <w:p>
+            <w:r>
+              <w:rPr>
+                <w:b/>
+                <w:sz w:val="19"/>
+              </w:rPr>
+              <w:t>#</w:t>
+            </w:r>
+          </w:p>
+        </w:tc>
+        <w:tc>
+          <w:tcPr>
+            <w:tcW w:type="dxa" w:w="2268"/>
+            <w:shd w:val="clear" w:color="auto" w:fill="D9E2F3"/>
+          </w:tcPr>
+          <w:p>
+            <w:r>
+              <w:rPr>
+                <w:b/>
+                <w:sz w:val="19"/>
+              </w:rPr>
+              <w:t>Butir</w:t>
+            </w:r>
+          </w:p>
+        </w:tc>
+        <w:tc>
+          <w:tcPr>
+            <w:tcW w:type="dxa" w:w="2438"/>
+            <w:shd w:val="clear" w:color="auto" w:fill="D9E2F3"/>
+          </w:tcPr>
+          <w:p>
+            <w:r>
+              <w:rPr>
+                <w:b/>
+                <w:sz w:val="19"/>
+              </w:rPr>
+              <w:t>Cara</w:t>
+            </w:r>
+          </w:p>
+        </w:tc>
+        <w:tc>
+          <w:tcPr>
+            <w:tcW w:type="dxa" w:w="1701"/>
+            <w:shd w:val="clear" w:color="auto" w:fill="D9E2F3"/>
+          </w:tcPr>
+          <w:p>
+            <w:r>
+              <w:rPr>
+                <w:b/>
+                <w:sz w:val="19"/>
+              </w:rPr>
+              <w:t>Catat</w:t>
+            </w:r>
+          </w:p>
+        </w:tc>
+        <w:tc>
+          <w:tcPr>
+            <w:tcW w:type="dxa" w:w="2835"/>
+            <w:shd w:val="clear" w:color="auto" w:fill="D9E2F3"/>
+          </w:tcPr>
+          <w:p>
+            <w:r>
+              <w:rPr>
+                <w:b/>
+                <w:sz w:val="19"/>
+              </w:rPr>
+              <w:t>Hasil</w:t>
+            </w:r>
+          </w:p>
+        </w:tc>
+      </w:tr>
+      <w:tr>
+        <w:trPr>
+          <w:trHeight w:val="567"/>
+        </w:trPr>
+        <w:tc>
+          <w:tcPr>
+            <w:tcW w:type="dxa" w:w="397"/>
+          </w:tcPr>
+          <w:p>
+            <w:r>
+              <w:rPr>
+                <w:b w:val="0"/>
+                <w:sz w:val="19"/>
+              </w:rPr>
+              <w:t>1</w:t>
+            </w:r>
+          </w:p>
+        </w:tc>
+        <w:tc>
+          <w:tcPr>
+            <w:tcW w:type="dxa" w:w="2268"/>
+          </w:tcPr>
+          <w:p>
+            <w:r>
+              <w:rPr>
+                <w:b w:val="0"/>
+                <w:sz w:val="19"/>
+              </w:rPr>
+              <w:t>Pekerjaan di WS-3 sekitar 10 Agu 2026 (dibersihkan, dikalibrasi, diganti?)</w:t>
+            </w:r>
+          </w:p>
+        </w:tc>
+        <w:tc>
+          <w:tcPr>
+            <w:tcW w:type="dxa" w:w="2438"/>
+          </w:tcPr>
+          <w:p>
+            <w:r>
+              <w:rPr>
+                <w:b w:val="0"/>
+                <w:sz w:val="19"/>
+              </w:rPr>
+              <w:t>log pekerjaan O&amp;M</w:t>
+            </w:r>
+          </w:p>
+        </w:tc>
+        <w:tc>
+          <w:tcPr>
+            <w:tcW w:type="dxa" w:w="1701"/>
+          </w:tcPr>
+          <w:p>
+            <w:r>
+              <w:rPr>
+                <w:b w:val="0"/>
+                <w:sz w:val="19"/>
+              </w:rPr>
+              <w:t>tanggal, jenis pekerjaan</w:t>
+            </w:r>
+          </w:p>
+        </w:tc>
+        <w:tc>
+          <w:tcPr>
+            <w:tcW w:type="dxa" w:w="2835"/>
+          </w:tcPr>
+          <w:p/>
+        </w:tc>
+      </w:tr>
+      <w:tr>
+        <w:trPr>
+          <w:trHeight w:val="567"/>
+        </w:trPr>
+        <w:tc>
+          <w:tcPr>
+            <w:tcW w:type="dxa" w:w="397"/>
+          </w:tcPr>
+          <w:p>
+            <w:r>
+              <w:rPr>
+                <w:b w:val="0"/>
+                <w:sz w:val="19"/>
+              </w:rPr>
+              <w:t>2</w:t>
+            </w:r>
+          </w:p>
+        </w:tc>
+        <w:tc>
+          <w:tcPr>
+            <w:tcW w:type="dxa" w:w="2268"/>
+          </w:tcPr>
+          <w:p>
+            <w:r>
+              <w:rPr>
+                <w:b w:val="0"/>
+                <w:sz w:val="19"/>
+              </w:rPr>
+              <w:t>Apakah WS-2 juga dikerjakan sekitar 10 Agu 2026</w:t>
+            </w:r>
+          </w:p>
+        </w:tc>
+        <w:tc>
+          <w:tcPr>
+            <w:tcW w:type="dxa" w:w="2438"/>
+          </w:tcPr>
+          <w:p>
+            <w:r>
+              <w:rPr>
+                <w:b w:val="0"/>
+                <w:sz w:val="19"/>
+              </w:rPr>
+              <w:t>log pekerjaan O&amp;M</w:t>
+            </w:r>
+          </w:p>
+        </w:tc>
+        <w:tc>
+          <w:tcPr>
+            <w:tcW w:type="dxa" w:w="1701"/>
+          </w:tcPr>
+          <w:p>
+            <w:r>
+              <w:rPr>
+                <w:b w:val="0"/>
+                <w:sz w:val="19"/>
+              </w:rPr>
+              <w:t>tanggal, jenis pekerjaan</w:t>
+            </w:r>
+          </w:p>
+        </w:tc>
+        <w:tc>
+          <w:tcPr>
+            <w:tcW w:type="dxa" w:w="2835"/>
+          </w:tcPr>
+          <w:p/>
+        </w:tc>
+      </w:tr>
+      <w:tr>
+        <w:trPr>
+          <w:trHeight w:val="567"/>
+        </w:trPr>
+        <w:tc>
+          <w:tcPr>
+            <w:tcW w:type="dxa" w:w="397"/>
+          </w:tcPr>
+          <w:p>
+            <w:r>
+              <w:rPr>
+                <w:b w:val="0"/>
+                <w:sz w:val="19"/>
+              </w:rPr>
+              <w:t>3</w:t>
+            </w:r>
+          </w:p>
+        </w:tc>
+        <w:tc>
+          <w:tcPr>
+            <w:tcW w:type="dxa" w:w="2268"/>
+          </w:tcPr>
+          <w:p>
+            <w:r>
+              <w:rPr>
+                <w:b w:val="0"/>
+                <w:sz w:val="19"/>
+              </w:rPr>
+              <w:t>Log pembersihan kubah pyranometer semua WS, 2025–2026</w:t>
+            </w:r>
+          </w:p>
+        </w:tc>
+        <w:tc>
+          <w:tcPr>
+            <w:tcW w:type="dxa" w:w="2438"/>
+          </w:tcPr>
+          <w:p>
+            <w:r>
+              <w:rPr>
+                <w:b w:val="0"/>
+                <w:sz w:val="19"/>
+              </w:rPr>
+              <w:t>log/jadwal O&amp;M</w:t>
+            </w:r>
+          </w:p>
+        </w:tc>
+        <w:tc>
+          <w:tcPr>
+            <w:tcW w:type="dxa" w:w="1701"/>
+          </w:tcPr>
+          <w:p>
+            <w:r>
+              <w:rPr>
+                <w:b w:val="0"/>
+                <w:sz w:val="19"/>
+              </w:rPr>
+              <w:t>tanggal per WS</w:t>
+            </w:r>
+          </w:p>
+        </w:tc>
+        <w:tc>
+          <w:tcPr>
+            <w:tcW w:type="dxa" w:w="2835"/>
+          </w:tcPr>
+          <w:p/>
+        </w:tc>
+      </w:tr>
+      <w:tr>
+        <w:trPr>
+          <w:trHeight w:val="567"/>
+        </w:trPr>
+        <w:tc>
+          <w:tcPr>
+            <w:tcW w:type="dxa" w:w="397"/>
+          </w:tcPr>
+          <w:p>
+            <w:r>
+              <w:rPr>
+                <w:b w:val="0"/>
+                <w:sz w:val="19"/>
+              </w:rPr>
+              <w:t>4</w:t>
+            </w:r>
+          </w:p>
+        </w:tc>
+        <w:tc>
+          <w:tcPr>
+            <w:tcW w:type="dxa" w:w="2268"/>
+          </w:tcPr>
+          <w:p>
+            <w:r>
+              <w:rPr>
+                <w:b w:val="0"/>
+                <w:sz w:val="19"/>
+              </w:rPr>
+              <w:t>Jadwal pembersihan rutin pyranometer</w:t>
+            </w:r>
+          </w:p>
+        </w:tc>
+        <w:tc>
+          <w:tcPr>
+            <w:tcW w:type="dxa" w:w="2438"/>
+          </w:tcPr>
+          <w:p>
+            <w:r>
+              <w:rPr>
+                <w:b w:val="0"/>
+                <w:sz w:val="19"/>
+              </w:rPr>
+              <w:t>SOP O&amp;M</w:t>
+            </w:r>
+          </w:p>
+        </w:tc>
+        <w:tc>
+          <w:tcPr>
+            <w:tcW w:type="dxa" w:w="1701"/>
+          </w:tcPr>
+          <w:p>
+            <w:r>
+              <w:rPr>
+                <w:b w:val="0"/>
+                <w:sz w:val="19"/>
+              </w:rPr>
+              <w:t>frekuensi</w:t>
+            </w:r>
+          </w:p>
+        </w:tc>
+        <w:tc>
+          <w:tcPr>
+            <w:tcW w:type="dxa" w:w="2835"/>
+          </w:tcPr>
+          <w:p/>
+        </w:tc>
+      </w:tr>
+    </w:tbl>
+    <w:p/>
+    <w:p>
+      <w:pPr>
+        <w:pStyle w:val="Heading1"/>
+      </w:pPr>
+      <w:r>
+        <w:rPr>
+          <w:color w:val="1F3A5F"/>
+        </w:rPr>
+        <w:t>4. Sesudah kunjungan</w:t>
       </w:r>
     </w:p>
     <w:p>

</xml_diff>

<commit_message>
fix(poa): titik ubah pisah arah berbalik dan buang jam penghalang; hasil run pembanding
- titik_ubah: kelompok kandidat dipisah bila tanda lompatan berbalik (turun lalu naik
  = dua peristiwa).
- rasio_harian(..., jam_penghalang=...): bayangan WS-1 yang berubah mengikuti matahari
  bukan lompatan gain; CLI meneruskan sheet Penghalang.
- Run --pembanding WS-3,WS-4,WS-5: WS-4 usulan 1,000 (sehat); kandidat WS-3/WS-2
  2026-08-11, WS-5 2026-01-11 (baru, ditanyakan ke lapangan); WS-1 tidak stabil.

Co-Authored-By: Claude Opus 5.5 <noreply@anthropic.com>
</commit_message>
<xml_diff>
--- a/docs/Pemeriksaan_Lapangan_WS1_WS2.docx
+++ b/docs/Pemeriksaan_Lapangan_WS1_WS2.docx
@@ -2851,6 +2851,73 @@
           <w:p/>
         </w:tc>
       </w:tr>
+      <w:tr>
+        <w:trPr>
+          <w:trHeight w:val="567"/>
+        </w:trPr>
+        <w:tc>
+          <w:tcPr>
+            <w:tcW w:type="dxa" w:w="397"/>
+          </w:tcPr>
+          <w:p>
+            <w:r>
+              <w:rPr>
+                <w:b w:val="0"/>
+                <w:sz w:val="19"/>
+              </w:rPr>
+              <w:t>5</w:t>
+            </w:r>
+          </w:p>
+        </w:tc>
+        <w:tc>
+          <w:tcPr>
+            <w:tcW w:type="dxa" w:w="2268"/>
+          </w:tcPr>
+          <w:p>
+            <w:r>
+              <w:rPr>
+                <w:b w:val="0"/>
+                <w:sz w:val="19"/>
+              </w:rPr>
+              <w:t>Pekerjaan di WS-5 sekitar 11 Jan 2026 (sesudah data kosong Okt–Des 2025; WS-5 naik ~8 % sesudahnya)</w:t>
+            </w:r>
+          </w:p>
+        </w:tc>
+        <w:tc>
+          <w:tcPr>
+            <w:tcW w:type="dxa" w:w="2438"/>
+          </w:tcPr>
+          <w:p>
+            <w:r>
+              <w:rPr>
+                <w:b w:val="0"/>
+                <w:sz w:val="19"/>
+              </w:rPr>
+              <w:t>log pekerjaan O&amp;M</w:t>
+            </w:r>
+          </w:p>
+        </w:tc>
+        <w:tc>
+          <w:tcPr>
+            <w:tcW w:type="dxa" w:w="1701"/>
+          </w:tcPr>
+          <w:p>
+            <w:r>
+              <w:rPr>
+                <w:b w:val="0"/>
+                <w:sz w:val="19"/>
+              </w:rPr>
+              <w:t>tanggal, jenis pekerjaan</w:t>
+            </w:r>
+          </w:p>
+        </w:tc>
+        <w:tc>
+          <w:tcPr>
+            <w:tcW w:type="dxa" w:w="2835"/>
+          </w:tcPr>
+          <w:p/>
+        </w:tc>
+      </w:tr>
     </w:tbl>
     <w:p/>
     <w:p>

</xml_diff>